<commit_message>
saga and 2pc : added
</commit_message>
<xml_diff>
--- a/Java/java_interview_question.docx
+++ b/Java/java_interview_question.docx
@@ -3,19 +3,19 @@
 <w:document xmlns:wpc="http://schemas.microsoft.com/office/word/2010/wordprocessingCanvas" xmlns:cx="http://schemas.microsoft.com/office/drawing/2014/chartex" xmlns:cx1="http://schemas.microsoft.com/office/drawing/2015/9/8/chartex" xmlns:cx2="http://schemas.microsoft.com/office/drawing/2015/10/21/chartex" xmlns:cx3="http://schemas.microsoft.com/office/drawing/2016/5/9/chartex" xmlns:cx4="http://schemas.microsoft.com/office/drawing/2016/5/10/chartex" xmlns:cx5="http://schemas.microsoft.com/office/drawing/2016/5/11/chartex" xmlns:cx6="http://schemas.microsoft.com/office/drawing/2016/5/12/chartex" xmlns:cx7="http://schemas.microsoft.com/office/drawing/2016/5/13/chartex" xmlns:cx8="http://schemas.microsoft.com/office/drawing/2016/5/14/chartex" xmlns:mc="http://schemas.openxmlformats.org/markup-compatibility/2006" xmlns:aink="http://schemas.microsoft.com/office/drawing/2016/ink" xmlns:am3d="http://schemas.microsoft.com/office/drawing/2017/model3d" xmlns:o="urn:schemas-microsoft-com:office:office" xmlns:oel="http://schemas.microsoft.com/office/2019/extlst" xmlns:r="http://schemas.openxmlformats.org/officeDocument/2006/relationships" xmlns:m="http://schemas.openxmlformats.org/officeDocument/2006/math" xmlns:v="urn:schemas-microsoft-com:vml" xmlns:wp14="http://schemas.microsoft.com/office/word/2010/wordprocessingDrawing" xmlns:wp="http://schemas.openxmlformats.org/drawingml/2006/wordprocessingDrawing" xmlns:w10="urn:schemas-microsoft-com:office:word" xmlns:w="http://schemas.openxmlformats.org/wordprocessingml/2006/main" xmlns:w14="http://schemas.microsoft.com/office/word/2010/wordml" xmlns:w15="http://schemas.microsoft.com/office/word/2012/wordml" xmlns:w16cex="http://schemas.microsoft.com/office/word/2018/wordml/cex" xmlns:w16cid="http://schemas.microsoft.com/office/word/2016/wordml/cid" xmlns:w16="http://schemas.microsoft.com/office/word/2018/wordml" xmlns:w16du="http://schemas.microsoft.com/office/word/2023/wordml/word16du" xmlns:w16sdtdh="http://schemas.microsoft.com/office/word/2020/wordml/sdtdatahash" xmlns:w16sdtfl="http://schemas.microsoft.com/office/word/2024/wordml/sdtformatlock" xmlns:w16se="http://schemas.microsoft.com/office/word/2015/wordml/symex" xmlns:wpg="http://schemas.microsoft.com/office/word/2010/wordprocessingGroup" xmlns:wpi="http://schemas.microsoft.com/office/word/2010/wordprocessingInk" xmlns:wne="http://schemas.microsoft.com/office/word/2006/wordml" xmlns:wps="http://schemas.microsoft.com/office/word/2010/wordprocessingShape" mc:Ignorable="w14 w15 w16se w16cid w16 w16cex w16sdtdh w16sdtfl w16du wp14">
   <w:body>
     <w:p>
+      <w:pPr>
+        <w:pStyle w:val="ListParagraph"/>
+        <w:numPr>
+          <w:ilvl w:val="0"/>
+          <w:numId w:val="1"/>
+        </w:numPr>
+      </w:pPr>
       <w:r>
         <w:rPr>
           <w:b/>
           <w:bCs/>
         </w:rPr>
-        <w:t>A</w:t>
-      </w:r>
-      <w:r>
-        <w:rPr>
-          <w:b/>
-          <w:bCs/>
-        </w:rPr>
-        <w:t>. Core Java</w:t>
+        <w:t>Core Java</w:t>
       </w:r>
       <w:r>
         <w:br/>
@@ -512,129 +512,341 @@
       </w:r>
       <w:r>
         <w:rPr>
-          <w:b/>
-          <w:bCs/>
+          <w:rFonts w:ascii="Cambria Math" w:hAnsi="Cambria Math" w:cs="Cambria Math"/>
         </w:rPr>
-        <w:t>8. Coding Questions</w:t>
-      </w:r>
-      <w:r>
-        <w:br/>
-        <w:t>Missing number in array</w:t>
-      </w:r>
-      <w:r>
-        <w:br/>
-        <w:t>Move zeros to the end</w:t>
-      </w:r>
-      <w:r>
-        <w:br/>
-        <w:t>Maximum subarray sum-</w:t>
+        <w:t>𝗖𝗢𝗥𝗘</w:t>
+      </w:r>
+      <w:r>
+        <w:t xml:space="preserve"> </w:t>
+      </w:r>
+      <w:r>
+        <w:rPr>
+          <w:rFonts w:ascii="Cambria Math" w:hAnsi="Cambria Math" w:cs="Cambria Math"/>
+        </w:rPr>
+        <w:t>𝗝𝗔𝗩𝗔</w:t>
+      </w:r>
+      <w:r>
+        <w:t>:</w:t>
+      </w:r>
+      <w:r>
+        <w:br/>
+      </w:r>
+      <w:r>
+        <w:br/>
+        <w:t>3. What happens when a thread pool’s work queue reaches capacity?</w:t>
+      </w:r>
+      <w:r>
+        <w:br/>
+        <w:t>4. What are the consequences of using a mutable object as a HashMap key?</w:t>
+      </w:r>
+      <w:r>
+        <w:br/>
+        <w:t xml:space="preserve">6. Optional: </w:t>
       </w:r>
       <w:proofErr w:type="spellStart"/>
-      <w:r>
-        <w:t>Kadane's</w:t>
+      <w:proofErr w:type="gramStart"/>
+      <w:r>
+        <w:t>orElse</w:t>
       </w:r>
       <w:proofErr w:type="spellEnd"/>
       <w:r>
-        <w:t xml:space="preserve"> Algorithm</w:t>
-      </w:r>
-      <w:r>
-        <w:br/>
-        <w:t>Merge two sorted arrays</w:t>
-      </w:r>
-      <w:r>
-        <w:br/>
-        <w:t>Character frequency</w:t>
-      </w:r>
-      <w:r>
-        <w:br/>
-        <w:t>First non-repeated character</w:t>
-      </w:r>
-      <w:r>
-        <w:br/>
-        <w:t>Middle element of linked list</w:t>
-      </w:r>
-      <w:r>
-        <w:br/>
-        <w:t>Remove duplicate characters preserving order</w:t>
-      </w:r>
-      <w:r>
-        <w:br/>
-        <w:t>Check equal character frequencies</w:t>
-      </w:r>
-      <w:r>
-        <w:br/>
-        <w:t>Anagram check</w:t>
-      </w:r>
-      <w:r>
-        <w:br/>
-        <w:t>Reverse words in a sentence</w:t>
-      </w:r>
-      <w:r>
-        <w:br/>
-        <w:t>Count vowels and consonants</w:t>
-      </w:r>
-      <w:r>
-        <w:br/>
-        <w:t>Longest substring without repeating characters</w:t>
-      </w:r>
-      <w:r>
-        <w:br/>
-        <w:t xml:space="preserve">Reverse string without </w:t>
+        <w:t>(</w:t>
+      </w:r>
+      <w:proofErr w:type="gramEnd"/>
+      <w:r>
+        <w:t xml:space="preserve">) vs </w:t>
       </w:r>
       <w:proofErr w:type="spellStart"/>
-      <w:r>
-        <w:t>builtin</w:t>
+      <w:proofErr w:type="gramStart"/>
+      <w:r>
+        <w:t>orElseGet</w:t>
       </w:r>
       <w:proofErr w:type="spellEnd"/>
       <w:r>
-        <w:t xml:space="preserve"> methods</w:t>
+        <w:t>(</w:t>
+      </w:r>
+      <w:proofErr w:type="gramEnd"/>
+      <w:r>
+        <w:t>).</w:t>
+      </w:r>
+      <w:r>
+        <w:br/>
+        <w:t xml:space="preserve">7. Your service throws </w:t>
+      </w:r>
+      <w:proofErr w:type="spellStart"/>
+      <w:r>
+        <w:t>OutOfMemoryError</w:t>
+      </w:r>
+      <w:proofErr w:type="spellEnd"/>
+      <w:r>
+        <w:t xml:space="preserve"> in production. What are your first diagnostic steps?</w:t>
+      </w:r>
+      <w:r>
+        <w:br/>
+        <w:t>8. Virtual threads: when do they improve scalability, and where do they fall short?</w:t>
+      </w:r>
+    </w:p>
+    <w:p>
+      <w:pPr>
+        <w:pStyle w:val="ListParagraph"/>
+      </w:pPr>
+      <w:r>
+        <w:t xml:space="preserve">6. </w:t>
+      </w:r>
+      <w:proofErr w:type="gramStart"/>
+      <w:r>
+        <w:t>map(</w:t>
+      </w:r>
+      <w:proofErr w:type="gramEnd"/>
+      <w:r>
+        <w:t xml:space="preserve">) vs </w:t>
+      </w:r>
+      <w:proofErr w:type="spellStart"/>
+      <w:proofErr w:type="gramStart"/>
+      <w:r>
+        <w:t>flatMap</w:t>
+      </w:r>
+      <w:proofErr w:type="spellEnd"/>
+      <w:r>
+        <w:t>(</w:t>
+      </w:r>
+      <w:proofErr w:type="gramEnd"/>
+      <w:r>
+        <w:t>)?</w:t>
+      </w:r>
+      <w:r>
+        <w:br/>
+        <w:t xml:space="preserve">7. synchronized vs </w:t>
+      </w:r>
+      <w:proofErr w:type="spellStart"/>
+      <w:r>
+        <w:t>ReentrantLock</w:t>
+      </w:r>
+      <w:proofErr w:type="spellEnd"/>
+      <w:r>
+        <w:t>?</w:t>
+      </w:r>
+      <w:r>
+        <w:br/>
+        <w:t>8. Runnable vs Callable?</w:t>
+      </w:r>
+      <w:r>
+        <w:br/>
+      </w:r>
+      <w:r>
+        <w:br/>
+      </w:r>
+      <w:r>
+        <w:rPr>
+          <w:rFonts w:ascii="Cambria Math" w:hAnsi="Cambria Math" w:cs="Cambria Math"/>
+        </w:rPr>
+        <w:t>𝗦𝗣𝗥𝗜𝗡𝗚</w:t>
+      </w:r>
+      <w:r>
+        <w:t xml:space="preserve"> </w:t>
+      </w:r>
+      <w:r>
+        <w:rPr>
+          <w:rFonts w:ascii="Cambria Math" w:hAnsi="Cambria Math" w:cs="Cambria Math"/>
+        </w:rPr>
+        <w:t>𝗕𝗢𝗢𝗧</w:t>
+      </w:r>
+      <w:r>
+        <w:t xml:space="preserve"> </w:t>
+      </w:r>
+      <w:r>
+        <w:rPr>
+          <w:rFonts w:ascii="Cambria Math" w:hAnsi="Cambria Math" w:cs="Cambria Math"/>
+        </w:rPr>
+        <w:t>𝗔𝗡𝗗</w:t>
+      </w:r>
+      <w:r>
+        <w:t xml:space="preserve"> </w:t>
+      </w:r>
+      <w:r>
+        <w:rPr>
+          <w:rFonts w:ascii="Cambria Math" w:hAnsi="Cambria Math" w:cs="Cambria Math"/>
+        </w:rPr>
+        <w:t>𝗠𝗜𝗖𝗥𝗢𝗦𝗘𝗥𝗩𝗜𝗖𝗘𝗦</w:t>
+      </w:r>
+      <w:r>
+        <w:t>:</w:t>
+      </w:r>
+      <w:r>
+        <w:br/>
+        <w:t>1. How does JWT-based authentication work?</w:t>
+      </w:r>
+      <w:r>
+        <w:br/>
+        <w:t>2. What is the difference between OAuth2 and JWT?</w:t>
+      </w:r>
+      <w:r>
+        <w:br/>
+        <w:t xml:space="preserve">3. </w:t>
+      </w:r>
+      <w:proofErr w:type="spellStart"/>
+      <w:r>
+        <w:t>RestTemplate</w:t>
+      </w:r>
+      <w:proofErr w:type="spellEnd"/>
+      <w:r>
+        <w:t xml:space="preserve"> vs </w:t>
+      </w:r>
+      <w:proofErr w:type="spellStart"/>
+      <w:r>
+        <w:t>WebClient</w:t>
+      </w:r>
+      <w:proofErr w:type="spellEnd"/>
+      <w:r>
+        <w:t xml:space="preserve"> vs </w:t>
+      </w:r>
+      <w:proofErr w:type="spellStart"/>
+      <w:r>
+        <w:t>RestClient</w:t>
+      </w:r>
+      <w:proofErr w:type="spellEnd"/>
+      <w:r>
+        <w:t>.</w:t>
       </w:r>
       <w:r>
         <w:br/>
       </w:r>
       <w:r>
         <w:lastRenderedPageBreak/>
-        <w:t>Two numbers matching a target sum</w:t>
-      </w:r>
-      <w:r>
-        <w:br/>
-        <w:t>Largest and smallest array elements</w:t>
-      </w:r>
-      <w:r>
-        <w:br/>
-        <w:t>Second-largest number</w:t>
-      </w:r>
-      <w:r>
-        <w:br/>
-        <w:t>Intersection of two arrays</w:t>
-      </w:r>
-      <w:r>
-        <w:br/>
-        <w:t>Rotate array left and right</w:t>
-      </w:r>
-      <w:r>
-        <w:br/>
-        <w:t>Highest employee salary using Streams</w:t>
-      </w:r>
-      <w:r>
-        <w:br/>
-        <w:t>Second-highest salary</w:t>
-      </w:r>
-      <w:r>
-        <w:br/>
-        <w:t>Sort employees by salary</w:t>
-      </w:r>
-      <w:r>
-        <w:br/>
-        <w:t>Convert list to map</w:t>
-      </w:r>
-      <w:r>
-        <w:br/>
-        <w:t>Separate even and odd numbers</w:t>
-      </w:r>
-      <w:r>
-        <w:br/>
-        <w:t>Factorial of a number</w:t>
+        <w:t>4. How do microservices communicate with each other?</w:t>
+      </w:r>
+      <w:r>
+        <w:br/>
+        <w:t>5. What is the role of an API Gateway?</w:t>
+      </w:r>
+      <w:r>
+        <w:br/>
+        <w:t>6. How do you implement global exception handling in Spring Boot?</w:t>
+      </w:r>
+      <w:r>
+        <w:br/>
+        <w:t>7. How does @Transactional work internally?</w:t>
+      </w:r>
+      <w:r>
+        <w:br/>
+        <w:t>8. Why does @Transactional fail on self-invocation within the same class?</w:t>
+      </w:r>
+      <w:r>
+        <w:br/>
+      </w:r>
+      <w:r>
+        <w:br/>
+      </w:r>
+      <w:r>
+        <w:rPr>
+          <w:rFonts w:ascii="Cambria Math" w:hAnsi="Cambria Math" w:cs="Cambria Math"/>
+        </w:rPr>
+        <w:t>𝗞𝗔𝗙𝗞𝗔</w:t>
+      </w:r>
+      <w:r>
+        <w:t xml:space="preserve"> </w:t>
+      </w:r>
+      <w:r>
+        <w:rPr>
+          <w:rFonts w:ascii="Cambria Math" w:hAnsi="Cambria Math" w:cs="Cambria Math"/>
+        </w:rPr>
+        <w:t>𝗔𝗡𝗗</w:t>
+      </w:r>
+      <w:r>
+        <w:t xml:space="preserve"> </w:t>
+      </w:r>
+      <w:r>
+        <w:rPr>
+          <w:rFonts w:ascii="Cambria Math" w:hAnsi="Cambria Math" w:cs="Cambria Math"/>
+        </w:rPr>
+        <w:t>𝗠𝗘𝗦𝗦𝗔𝗚𝗜𝗡𝗚</w:t>
+      </w:r>
+      <w:r>
+        <w:t>:</w:t>
+      </w:r>
+      <w:r>
+        <w:br/>
+        <w:t>1. Why choose Kafka over RabbitMQ?</w:t>
+      </w:r>
+      <w:r>
+        <w:br/>
+        <w:t>2. How do partitions work?</w:t>
+      </w:r>
+      <w:r>
+        <w:br/>
+        <w:t>3. What happens if a consumer crashes mid-batch?</w:t>
+      </w:r>
+      <w:r>
+        <w:br/>
+        <w:t>4. How do you guarantee message ordering?</w:t>
+      </w:r>
+      <w:r>
+        <w:br/>
+        <w:t>5. How do you design an idempotent consumer?</w:t>
+      </w:r>
+      <w:r>
+        <w:br/>
+        <w:t>6. What is a Dead Letter Queue, and when should you use one?</w:t>
+      </w:r>
+      <w:r>
+        <w:br/>
+      </w:r>
+      <w:r>
+        <w:br/>
+      </w:r>
+      <w:r>
+        <w:rPr>
+          <w:rFonts w:ascii="Cambria Math" w:hAnsi="Cambria Math" w:cs="Cambria Math"/>
+        </w:rPr>
+        <w:t>𝗗𝗔𝗧𝗔𝗕𝗔𝗦𝗘</w:t>
+      </w:r>
+      <w:r>
+        <w:t xml:space="preserve"> </w:t>
+      </w:r>
+      <w:r>
+        <w:rPr>
+          <w:rFonts w:ascii="Cambria Math" w:hAnsi="Cambria Math" w:cs="Cambria Math"/>
+        </w:rPr>
+        <w:t>𝗔𝗡𝗗</w:t>
+      </w:r>
+      <w:r>
+        <w:t xml:space="preserve"> </w:t>
+      </w:r>
+      <w:r>
+        <w:rPr>
+          <w:rFonts w:ascii="Cambria Math" w:hAnsi="Cambria Math" w:cs="Cambria Math"/>
+        </w:rPr>
+        <w:t>𝗝𝗣𝗔</w:t>
+      </w:r>
+      <w:r>
+        <w:t>:</w:t>
+      </w:r>
+      <w:r>
+        <w:br/>
+        <w:t>1. First-level vs second-level cache in Hibernate.</w:t>
+      </w:r>
+      <w:r>
+        <w:br/>
+        <w:t>2. What is the N+1 problem?</w:t>
+      </w:r>
+      <w:r>
+        <w:br/>
+        <w:t>3. How do you identify and optimize a slow query?</w:t>
+      </w:r>
+      <w:r>
+        <w:br/>
+        <w:t>4. How do you handle concurrent updates to the same row?</w:t>
+      </w:r>
+      <w:r>
+        <w:br/>
+      </w:r>
+      <w:r>
+        <w:br/>
+        <w:t>2. What is a circuit breaker?</w:t>
+      </w:r>
+      <w:r>
+        <w:br/>
+        <w:t>4. How do you trace a single request across six services?</w:t>
       </w:r>
     </w:p>
     <w:sectPr>
@@ -645,6 +857,104 @@
     </w:sectPr>
   </w:body>
 </w:document>
+</file>
+
+<file path=word/numbering.xml><?xml version="1.0" encoding="utf-8"?>
+<w:numbering xmlns:wpc="http://schemas.microsoft.com/office/word/2010/wordprocessingCanvas" xmlns:cx="http://schemas.microsoft.com/office/drawing/2014/chartex" xmlns:cx1="http://schemas.microsoft.com/office/drawing/2015/9/8/chartex" xmlns:cx2="http://schemas.microsoft.com/office/drawing/2015/10/21/chartex" xmlns:cx3="http://schemas.microsoft.com/office/drawing/2016/5/9/chartex" xmlns:cx4="http://schemas.microsoft.com/office/drawing/2016/5/10/chartex" xmlns:cx5="http://schemas.microsoft.com/office/drawing/2016/5/11/chartex" xmlns:cx6="http://schemas.microsoft.com/office/drawing/2016/5/12/chartex" xmlns:cx7="http://schemas.microsoft.com/office/drawing/2016/5/13/chartex" xmlns:cx8="http://schemas.microsoft.com/office/drawing/2016/5/14/chartex" xmlns:mc="http://schemas.openxmlformats.org/markup-compatibility/2006" xmlns:aink="http://schemas.microsoft.com/office/drawing/2016/ink" xmlns:am3d="http://schemas.microsoft.com/office/drawing/2017/model3d" xmlns:o="urn:schemas-microsoft-com:office:office" xmlns:oel="http://schemas.microsoft.com/office/2019/extlst" xmlns:r="http://schemas.openxmlformats.org/officeDocument/2006/relationships" xmlns:m="http://schemas.openxmlformats.org/officeDocument/2006/math" xmlns:v="urn:schemas-microsoft-com:vml" xmlns:wp14="http://schemas.microsoft.com/office/word/2010/wordprocessingDrawing" xmlns:wp="http://schemas.openxmlformats.org/drawingml/2006/wordprocessingDrawing" xmlns:w10="urn:schemas-microsoft-com:office:word" xmlns:w="http://schemas.openxmlformats.org/wordprocessingml/2006/main" xmlns:w14="http://schemas.microsoft.com/office/word/2010/wordml" xmlns:w15="http://schemas.microsoft.com/office/word/2012/wordml" xmlns:w16cex="http://schemas.microsoft.com/office/word/2018/wordml/cex" xmlns:w16cid="http://schemas.microsoft.com/office/word/2016/wordml/cid" xmlns:w16="http://schemas.microsoft.com/office/word/2018/wordml" xmlns:w16du="http://schemas.microsoft.com/office/word/2023/wordml/word16du" xmlns:w16sdtdh="http://schemas.microsoft.com/office/word/2020/wordml/sdtdatahash" xmlns:w16sdtfl="http://schemas.microsoft.com/office/word/2024/wordml/sdtformatlock" xmlns:w16se="http://schemas.microsoft.com/office/word/2015/wordml/symex" xmlns:wpg="http://schemas.microsoft.com/office/word/2010/wordprocessingGroup" xmlns:wpi="http://schemas.microsoft.com/office/word/2010/wordprocessingInk" xmlns:wne="http://schemas.microsoft.com/office/word/2006/wordml" xmlns:wps="http://schemas.microsoft.com/office/word/2010/wordprocessingShape" mc:Ignorable="w14 w15 w16se w16cid w16 w16cex w16sdtdh w16sdtfl w16du wp14">
+  <w:abstractNum w:abstractNumId="0" w15:restartNumberingAfterBreak="0">
+    <w:nsid w:val="41941389"/>
+    <w:multiLevelType w:val="hybridMultilevel"/>
+    <w:tmpl w:val="99D4DEC2"/>
+    <w:lvl w:ilvl="0" w:tplc="D33AD046">
+      <w:start w:val="1"/>
+      <w:numFmt w:val="upperLetter"/>
+      <w:lvlText w:val="%1."/>
+      <w:lvlJc w:val="left"/>
+      <w:pPr>
+        <w:ind w:left="720" w:hanging="360"/>
+      </w:pPr>
+      <w:rPr>
+        <w:rFonts w:hint="default"/>
+        <w:b/>
+      </w:rPr>
+    </w:lvl>
+    <w:lvl w:ilvl="1" w:tplc="04090019" w:tentative="1">
+      <w:start w:val="1"/>
+      <w:numFmt w:val="lowerLetter"/>
+      <w:lvlText w:val="%2."/>
+      <w:lvlJc w:val="left"/>
+      <w:pPr>
+        <w:ind w:left="1440" w:hanging="360"/>
+      </w:pPr>
+    </w:lvl>
+    <w:lvl w:ilvl="2" w:tplc="0409001B" w:tentative="1">
+      <w:start w:val="1"/>
+      <w:numFmt w:val="lowerRoman"/>
+      <w:lvlText w:val="%3."/>
+      <w:lvlJc w:val="right"/>
+      <w:pPr>
+        <w:ind w:left="2160" w:hanging="180"/>
+      </w:pPr>
+    </w:lvl>
+    <w:lvl w:ilvl="3" w:tplc="0409000F" w:tentative="1">
+      <w:start w:val="1"/>
+      <w:numFmt w:val="decimal"/>
+      <w:lvlText w:val="%4."/>
+      <w:lvlJc w:val="left"/>
+      <w:pPr>
+        <w:ind w:left="2880" w:hanging="360"/>
+      </w:pPr>
+    </w:lvl>
+    <w:lvl w:ilvl="4" w:tplc="04090019" w:tentative="1">
+      <w:start w:val="1"/>
+      <w:numFmt w:val="lowerLetter"/>
+      <w:lvlText w:val="%5."/>
+      <w:lvlJc w:val="left"/>
+      <w:pPr>
+        <w:ind w:left="3600" w:hanging="360"/>
+      </w:pPr>
+    </w:lvl>
+    <w:lvl w:ilvl="5" w:tplc="0409001B" w:tentative="1">
+      <w:start w:val="1"/>
+      <w:numFmt w:val="lowerRoman"/>
+      <w:lvlText w:val="%6."/>
+      <w:lvlJc w:val="right"/>
+      <w:pPr>
+        <w:ind w:left="4320" w:hanging="180"/>
+      </w:pPr>
+    </w:lvl>
+    <w:lvl w:ilvl="6" w:tplc="0409000F" w:tentative="1">
+      <w:start w:val="1"/>
+      <w:numFmt w:val="decimal"/>
+      <w:lvlText w:val="%7."/>
+      <w:lvlJc w:val="left"/>
+      <w:pPr>
+        <w:ind w:left="5040" w:hanging="360"/>
+      </w:pPr>
+    </w:lvl>
+    <w:lvl w:ilvl="7" w:tplc="04090019" w:tentative="1">
+      <w:start w:val="1"/>
+      <w:numFmt w:val="lowerLetter"/>
+      <w:lvlText w:val="%8."/>
+      <w:lvlJc w:val="left"/>
+      <w:pPr>
+        <w:ind w:left="5760" w:hanging="360"/>
+      </w:pPr>
+    </w:lvl>
+    <w:lvl w:ilvl="8" w:tplc="0409001B" w:tentative="1">
+      <w:start w:val="1"/>
+      <w:numFmt w:val="lowerRoman"/>
+      <w:lvlText w:val="%9."/>
+      <w:lvlJc w:val="right"/>
+      <w:pPr>
+        <w:ind w:left="6480" w:hanging="180"/>
+      </w:pPr>
+    </w:lvl>
+  </w:abstractNum>
+  <w:num w:numId="1" w16cid:durableId="510023961">
+    <w:abstractNumId w:val="0"/>
+  </w:num>
+</w:numbering>
 </file>
 
 <file path=word/styles.xml><?xml version="1.0" encoding="utf-8"?>
@@ -1250,7 +1560,6 @@
   <w:style w:type="character" w:default="1" w:styleId="DefaultParagraphFont">
     <w:name w:val="Default Paragraph Font"/>
     <w:uiPriority w:val="1"/>
-    <w:semiHidden/>
     <w:unhideWhenUsed/>
   </w:style>
   <w:style w:type="table" w:default="1" w:styleId="TableNormal">

</xml_diff>